<commit_message>
docs(report): add automatic heading numbering (numId 37) to Member C
</commit_message>
<xml_diff>
--- a/docs/Assignment1_Report_Group6.docx
+++ b/docs/Assignment1_Report_Group6.docx
@@ -9657,6 +9657,10 @@
     <w:p>
       <w:pPr>
         <w:pStyle w:val="Heading1"/>
+        <w:numPr>
+          <w:ilvl w:val="0"/>
+          <w:numId w:val="37"/>
+        </w:numPr>
       </w:pPr>
       <w:r>
         <w:rPr>
@@ -9670,6 +9674,10 @@
     <w:p>
       <w:pPr>
         <w:pStyle w:val="Heading2"/>
+        <w:numPr>
+          <w:ilvl w:val="1"/>
+          <w:numId w:val="37"/>
+        </w:numPr>
       </w:pPr>
       <w:r>
         <w:rPr>
@@ -10111,6 +10119,10 @@
     <w:p>
       <w:pPr>
         <w:pStyle w:val="Heading1"/>
+        <w:numPr>
+          <w:ilvl w:val="0"/>
+          <w:numId w:val="37"/>
+        </w:numPr>
       </w:pPr>
       <w:r>
         <w:rPr>
@@ -10124,6 +10136,10 @@
     <w:p>
       <w:pPr>
         <w:pStyle w:val="Heading2"/>
+        <w:numPr>
+          <w:ilvl w:val="1"/>
+          <w:numId w:val="37"/>
+        </w:numPr>
       </w:pPr>
       <w:r>
         <w:rPr>
@@ -10372,6 +10388,10 @@
     <w:p>
       <w:pPr>
         <w:pStyle w:val="Heading2"/>
+        <w:numPr>
+          <w:ilvl w:val="1"/>
+          <w:numId w:val="37"/>
+        </w:numPr>
       </w:pPr>
       <w:r>
         <w:rPr>
@@ -10588,6 +10608,10 @@
     <w:p>
       <w:pPr>
         <w:pStyle w:val="Heading2"/>
+        <w:numPr>
+          <w:ilvl w:val="1"/>
+          <w:numId w:val="37"/>
+        </w:numPr>
       </w:pPr>
       <w:r>
         <w:rPr>
@@ -10863,6 +10887,10 @@
     <w:p>
       <w:pPr>
         <w:pStyle w:val="Heading1"/>
+        <w:numPr>
+          <w:ilvl w:val="0"/>
+          <w:numId w:val="37"/>
+        </w:numPr>
       </w:pPr>
       <w:r>
         <w:rPr>
@@ -10876,6 +10904,10 @@
     <w:p>
       <w:pPr>
         <w:pStyle w:val="Heading2"/>
+        <w:numPr>
+          <w:ilvl w:val="1"/>
+          <w:numId w:val="37"/>
+        </w:numPr>
       </w:pPr>
       <w:r>
         <w:rPr>
@@ -11119,6 +11151,10 @@
     <w:p>
       <w:pPr>
         <w:pStyle w:val="Heading2"/>
+        <w:numPr>
+          <w:ilvl w:val="1"/>
+          <w:numId w:val="37"/>
+        </w:numPr>
       </w:pPr>
       <w:r>
         <w:rPr>
@@ -11378,6 +11414,10 @@
     <w:p>
       <w:pPr>
         <w:pStyle w:val="Heading1"/>
+        <w:numPr>
+          <w:ilvl w:val="0"/>
+          <w:numId w:val="37"/>
+        </w:numPr>
       </w:pPr>
       <w:r>
         <w:rPr>
@@ -11391,6 +11431,10 @@
     <w:p>
       <w:pPr>
         <w:pStyle w:val="Heading2"/>
+        <w:numPr>
+          <w:ilvl w:val="1"/>
+          <w:numId w:val="37"/>
+        </w:numPr>
       </w:pPr>
       <w:r>
         <w:rPr>

</xml_diff>

<commit_message>
docs(report): set heading numbering suffix to space to remove large tab gap
</commit_message>
<xml_diff>
--- a/docs/Assignment1_Report_Group6.docx
+++ b/docs/Assignment1_Report_Group6.docx
@@ -16889,10 +16889,11 @@
     <w:lvl w:ilvl="0">
       <w:start w:val="1"/>
       <w:numFmt w:val="upperRoman"/>
+      <w:suff w:val="space"/>
       <w:lvlText w:val="%1."/>
       <w:lvlJc w:val="left"/>
       <w:pPr>
-        <w:ind w:left="720" w:hanging="720"/>
+        <w:ind w:left="0" w:firstLine="0"/>
       </w:pPr>
       <w:rPr>
         <w:rFonts w:hint="default"/>
@@ -16902,10 +16903,11 @@
       <w:start w:val="1"/>
       <w:numFmt w:val="decimal"/>
       <w:isLgl/>
+      <w:suff w:val="space"/>
       <w:lvlText w:val="%1.%2."/>
       <w:lvlJc w:val="left"/>
       <w:pPr>
-        <w:ind w:left="810" w:hanging="720"/>
+        <w:ind w:left="0" w:firstLine="0"/>
       </w:pPr>
       <w:rPr>
         <w:rFonts w:hint="default"/>
@@ -16915,10 +16917,11 @@
       <w:start w:val="1"/>
       <w:numFmt w:val="decimal"/>
       <w:isLgl/>
+      <w:suff w:val="space"/>
       <w:lvlText w:val="%1.%2.%3."/>
       <w:lvlJc w:val="left"/>
       <w:pPr>
-        <w:ind w:left="720" w:hanging="720"/>
+        <w:ind w:left="0" w:firstLine="0"/>
       </w:pPr>
       <w:rPr>
         <w:rFonts w:hint="default"/>
@@ -16928,10 +16931,11 @@
       <w:start w:val="1"/>
       <w:numFmt w:val="decimal"/>
       <w:isLgl/>
+      <w:suff w:val="space"/>
       <w:lvlText w:val="%1.%2.%3.%4."/>
       <w:lvlJc w:val="left"/>
       <w:pPr>
-        <w:ind w:left="1080" w:hanging="1080"/>
+        <w:ind w:left="0" w:firstLine="0"/>
       </w:pPr>
       <w:rPr>
         <w:rFonts w:hint="default"/>
@@ -16941,10 +16945,11 @@
       <w:start w:val="1"/>
       <w:numFmt w:val="decimal"/>
       <w:isLgl/>
+      <w:suff w:val="space"/>
       <w:lvlText w:val="%1.%2.%3.%4.%5."/>
       <w:lvlJc w:val="left"/>
       <w:pPr>
-        <w:ind w:left="1080" w:hanging="1080"/>
+        <w:ind w:left="0" w:firstLine="0"/>
       </w:pPr>
       <w:rPr>
         <w:rFonts w:hint="default"/>
@@ -16954,10 +16959,11 @@
       <w:start w:val="1"/>
       <w:numFmt w:val="decimal"/>
       <w:isLgl/>
+      <w:suff w:val="space"/>
       <w:lvlText w:val="%1.%2.%3.%4.%5.%6."/>
       <w:lvlJc w:val="left"/>
       <w:pPr>
-        <w:ind w:left="1440" w:hanging="1440"/>
+        <w:ind w:left="0" w:firstLine="0"/>
       </w:pPr>
       <w:rPr>
         <w:rFonts w:hint="default"/>
@@ -16967,10 +16973,11 @@
       <w:start w:val="1"/>
       <w:numFmt w:val="decimal"/>
       <w:isLgl/>
+      <w:suff w:val="space"/>
       <w:lvlText w:val="%1.%2.%3.%4.%5.%6.%7."/>
       <w:lvlJc w:val="left"/>
       <w:pPr>
-        <w:ind w:left="1440" w:hanging="1440"/>
+        <w:ind w:left="0" w:firstLine="0"/>
       </w:pPr>
       <w:rPr>
         <w:rFonts w:hint="default"/>
@@ -16980,10 +16987,11 @@
       <w:start w:val="1"/>
       <w:numFmt w:val="decimal"/>
       <w:isLgl/>
+      <w:suff w:val="space"/>
       <w:lvlText w:val="%1.%2.%3.%4.%5.%6.%7.%8."/>
       <w:lvlJc w:val="left"/>
       <w:pPr>
-        <w:ind w:left="1800" w:hanging="1800"/>
+        <w:ind w:left="0" w:firstLine="0"/>
       </w:pPr>
       <w:rPr>
         <w:rFonts w:hint="default"/>
@@ -16993,10 +17001,11 @@
       <w:start w:val="1"/>
       <w:numFmt w:val="decimal"/>
       <w:isLgl/>
+      <w:suff w:val="space"/>
       <w:lvlText w:val="%1.%2.%3.%4.%5.%6.%7.%8.%9."/>
       <w:lvlJc w:val="left"/>
       <w:pPr>
-        <w:ind w:left="1800" w:hanging="1800"/>
+        <w:ind w:left="0" w:firstLine="0"/>
       </w:pPr>
       <w:rPr>
         <w:rFonts w:hint="default"/>

</xml_diff>